<commit_message>
Update resume generation to reflect latest experience and skills changes
Replit-Commit-Author: Agent
</commit_message>
<xml_diff>
--- a/scripts/output/ravi-kumar-resume.docx
+++ b/scripts/output/ravi-kumar-resume.docx
@@ -59,7 +59,7 @@
           <w:sz w:val="19"/>
           <w:szCs w:val="19"/>
         </w:rPr>
-        <w:t xml:space="preserve">Computer Science undergraduate with hands-on training in software development and a track record of building full working systems, from secure banking platforms to AI-driven proctoring tools. Strong fundamentals in programming, databases, and problem-solving, with a drive to build practical, real-world software.</w:t>
+        <w:t xml:space="preserve">Third-year Computer Science undergraduate who turns coursework into working software -- a full-stack banking system and a computer-vision exam proctoring tool -- rather than leaving it on paper. Trained hands-on in industrial software development at NSIC-ECIL and comfortable owning a project end-to-end, from database design to a working demo.</w:t>
       </w:r>
     </w:p>
     <w:p>
@@ -92,7 +92,7 @@
           <w:sz w:val="20"/>
           <w:szCs w:val="20"/>
         </w:rPr>
-        <w:t xml:space="preserve">Student Trainee</w:t>
+        <w:t xml:space="preserve">Student Trainee -- Software Development</w:t>
       </w:r>
       <w:r>
         <w:rPr>
@@ -135,7 +135,7 @@
           <w:sz w:val="19"/>
           <w:szCs w:val="19"/>
         </w:rPr>
-        <w:t xml:space="preserve">Completed hands-on industrial training in software development, covering the full lifecycle from design to implementation of real-world applications.</w:t>
+        <w:t xml:space="preserve">Completed a structured industrial training program covering the full software development lifecycle, from requirements and design to implementation and testing of real applications.</w:t>
       </w:r>
     </w:p>
     <w:p>
@@ -153,7 +153,7 @@
           <w:sz w:val="19"/>
           <w:szCs w:val="19"/>
         </w:rPr>
-        <w:t xml:space="preserve">Worked with industry-standard tools and technologies to build and debug academic and practical projects under professional guidance.</w:t>
+        <w:t xml:space="preserve">Built and debugged multiple academic and practical projects using industry-standard tools, applying professional coding and version-control practices.</w:t>
       </w:r>
     </w:p>
     <w:p>
@@ -171,7 +171,7 @@
           <w:sz w:val="19"/>
           <w:szCs w:val="19"/>
         </w:rPr>
-        <w:t xml:space="preserve">Strengthened core programming, problem-solving, and debugging skills through structured practical sessions.</w:t>
+        <w:t xml:space="preserve">Sharpened problem-solving and debugging discipline through daily hands-on lab sessions under engineer supervision.</w:t>
       </w:r>
     </w:p>
     <w:p>
@@ -242,7 +242,7 @@
           <w:sz w:val="19"/>
           <w:szCs w:val="19"/>
         </w:rPr>
-        <w:t xml:space="preserve">Built a secure banking application supporting account management, deposits, withdrawals, and transaction history, backed by a relational database design for data integrity and auditability.</w:t>
+        <w:t xml:space="preserve">Designed and built a full banking application covering account creation, deposits, withdrawals, and transaction history, backed by a normalized relational schema for data integrity, auditability, and fast lookups.</w:t>
       </w:r>
     </w:p>
     <w:p>
@@ -295,7 +295,7 @@
           <w:sz w:val="19"/>
           <w:szCs w:val="19"/>
         </w:rPr>
-        <w:t xml:space="preserve">Developed an AI-powered proctoring tool that uses real-time computer vision to detect suspicious activity during online exams, helping ensure exam integrity without manual supervision.</w:t>
+        <w:t xml:space="preserve">Built an AI-powered proctoring tool using real-time computer vision to flag suspicious behavior during online exams, enabling reliable, unattended exam monitoring at scale.</w:t>
       </w:r>
     </w:p>
     <w:p>
@@ -471,7 +471,7 @@
           <w:sz w:val="19"/>
           <w:szCs w:val="19"/>
         </w:rPr>
-        <w:t xml:space="preserve">    2025 - Present</w:t>
+        <w:t xml:space="preserve">    2025 - 2028 (Expected)</w:t>
       </w:r>
     </w:p>
     <w:p>
@@ -484,7 +484,7 @@
           <w:sz w:val="19"/>
           <w:szCs w:val="19"/>
         </w:rPr>
-        <w:t xml:space="preserve">Kommuri Pratap Reddy Institute of Technology, Hyderabad, Telangana</w:t>
+        <w:t xml:space="preserve">Kommuri Pratap Reddy Institute of Technology, Hyderabad, Telangana  |  Currently in 3rd Year</w:t>
       </w:r>
     </w:p>
     <w:p>

</xml_diff>